<commit_message>
Draft_095: replace Figure 1 with updated conceptual framework diagram
</commit_message>
<xml_diff>
--- a/thesis/003_ThesisProposal_Draft_095.docx
+++ b/thesis/003_ThesisProposal_Draft_095.docx
@@ -1054,7 +1054,7 @@
           <w:bCs w:val="0"/>
         </w:rPr>
         <w:t xml:space="preserve">
-        In practice, the coding scheme was adapted from Hyland (1998) as the type instrument and operationalized through the decision rules in Appendix A. After a holistic reading of each abstract, coding followed three stages. Step 1 marked all possible hedge candidates (wide net). This step did not yet count retained hedges. Step 2 identified function with two paired removal checks. The Working Test asks whether removing the device changes commitment to the truth of the proposition. If it does, the token is retained as Epistemic Caution (EC). The Reader Test asks whether, when truth-commitment stays the same, removing the device makes the claim more imposing, unattributed, or confrontational toward readers or prior work. If it does, the token is retained as Politeness/Deference (P). If neither check is met, the token is not a hedge and is logged as a false positive (FP). FP is a residual record, not a function label. The only function labels are P and EC (EC+P when both checks hold on one token). Step 3 assigned grammatical type (modal, lexical, adverbial, clause-level) to retained P and EC tokens only. In this corpus all 65 retained hedges were EC. No P forms appeared. RQ3 reports the functional profile of retained hedges (P versus EC). RQ4 is answered from frequency patterns together with interpretive reading under the lenses named above. Figure 1 remains the study overview figure and is a placeholder for a later update to match this pipeline.
+        In practice, the coding scheme was adapted from Hyland (1998) as the type instrument and operationalized through the decision rules in Appendix A. After a holistic reading of each abstract, coding followed three stages. Step 1 marked all possible hedge candidates (wide net). This step did not yet count retained hedges. Step 2 identified function with two paired removal checks. The Working Test asks whether removing the device changes commitment to the truth of the proposition. If it does, the token is retained as Epistemic Caution (EC). The Reader Test asks whether, when truth-commitment stays the same, removing the device makes the claim more imposing, unattributed, or confrontational toward readers or prior work. If it does, the token is retained as Politeness/Deference (P). If neither check is met, the token is not a hedge and is logged as a false positive (FP). FP is a residual record, not a function label. The only function labels are P and EC (EC+P when both checks hold on one token). Step 3 assigned grammatical type (modal, lexical, adverbial, clause-level) to retained P and EC tokens only. In this corpus all 65 retained hedges were EC. No P forms appeared. RQ3 reports the functional profile of retained hedges (P versus EC). RQ4 is answered from frequency patterns together with interpretive reading under the lenses named above. Figure 1 presents the study overview: research abstracts through Hyland-based identification and coding (functions EC and P; types lexical, modal, adverbial, clause-level), frequency analysis, cross-disciplinary comparison, and theoretical interpretation, yielding hedge patterns by discipline.
     </w:t>
       </w:r>
       <w:r>
@@ -1103,7 +1103,7 @@
           <w:bCs w:val="0"/>
         </w:rPr>
         <w:t xml:space="preserve">
-        The conceptual framework is presented in Figure 1. The grouping variable is discipline (Agriculture, Veterinary Medicine, and Biology). The outcome measures are hedge type frequency, distribution, and function. Figure 1 shows the study’s type and function categories in that pipeline. The analytical path moves from Step 1 and Step 2 through frequency analysis and cross-disciplinary comparison to functional and interpretive reading. Source jobs are stated in the framework text: Hyland (1998) supplies the type instrument and the starting point for EC and P on retained hedges, Crompton (1997) supports the Working Test for EC, Salager-Meyer (1994) is the Part IV claim-responsibility lens, and Hyland (2005) is the stance lens for implications. Figure 1 is retained as a placeholder overview figure and will be redrawn later to match the P/EC-only function scheme (FP as reject record, not a function). Two boundary conditions are acknowledged throughout. The texts are produced by developing researchers whose work may not yet reflect discipline-specific norms. The institutional context at PSAU includes L2 English use, but language proficiency is not measured as a variable in this design. These factors bound how far the findings may be generalized.
+        The conceptual framework is presented in Figure 1. The grouping variable is discipline (Agriculture, Veterinary Medicine, and Biology). The outcome measures are hedge type frequency, distribution, and function. Figure 1 shows the study’s type and function categories in that pipeline. The analytical path moves from Step 1 and Step 2 through frequency analysis and cross-disciplinary comparison to functional and interpretive reading. Source jobs are stated in the framework text: Hyland (1998) supplies the type instrument and the starting point for EC and P on retained hedges, Crompton (1997) supports the Working Test for EC, Salager-Meyer (1994) is the Part IV claim-responsibility lens, and Hyland (2005) is the stance lens for implications. Figure 1 shows functions as Epistemic Caution and Politeness only; false positives are a residual coding record, not a function category in the figure. Two boundary conditions are acknowledged throughout. The texts are produced by developing researchers whose work may not yet reflect discipline-specific norms. The institutional context at PSAU includes L2 English use, but language proficiency is not measured as a variable in this design. These factors bound how far the findings may be generalized.
     </w:t>
       </w:r>
       <w:r>

</xml_diff>